<commit_message>
Update project documentation to Baseline v1.0
</commit_message>
<xml_diff>
--- a/docs/מסמך_עיצוב_טכני_Architecture.docx
+++ b/docs/מסמך_עיצוב_טכני_Architecture.docx
@@ -1750,6 +1750,45 @@
           <w:szCs w:val="22"/>
         </w:rPr>
         <w:t xml:space="preserve">Dashboard/KPI (פרק 22 באפיון) יתוכנן עם יכולת סינון/צבירה לפי אתר מההתחלה, גם אם כרגע מוצג אתר יחיד.</w:t>
+      </w:r>
+    </w:p>
+    <w:p>
+      <w:pPr>
+        <w:pStyle w:val="Heading2"/>
+        <w:bidi/>
+        <w:spacing w:after="120" w:before="260"/>
+        <w:jc w:val="right"/>
+      </w:pPr>
+      <w:r>
+        <w:rPr>
+          <w:rFonts w:ascii="Arial" w:cs="Arial" w:eastAsia="Arial" w:hAnsi="Arial"/>
+          <w:b/>
+          <w:bCs/>
+          <w:color w:val="2E75B6"/>
+          <w:sz w:val="25"/>
+          <w:szCs w:val="25"/>
+        </w:rPr>
+        <w:t xml:space="preserve">9.1 פריט פתוח לארכיטקטורה — סריקת מסמכי קבלה (v2.1)</w:t>
+      </w:r>
+    </w:p>
+    <w:p>
+      <w:pPr>
+        <w:bidi/>
+        <w:spacing w:after="140" w:line="300"/>
+        <w:jc w:val="right"/>
+      </w:pPr>
+      <w:r>
+        <w:rPr>
+          <w:rFonts w:ascii="Arial" w:cs="Arial" w:eastAsia="Arial" w:hAnsi="Arial"/>
+          <w:b w:val="false"/>
+          <w:bCs w:val="false"/>
+          <w:i/>
+          <w:iCs/>
+          <w:color w:val="777777"/>
+          <w:sz w:val="22"/>
+          <w:szCs w:val="22"/>
+        </w:rPr>
+        <w:t xml:space="preserve">Business Specification v2.1 (פרק 10.1-10.3) קובע שקבלת סחורה מתחילה בסריקת תעודת משלוח/חשבונית, שממנה המערכת שולפת אוטומטית ספק/פריטים/כמויות. זוהי דרישה עסקית מאושרת, אך הבחירה הטכנולוגית הספציפית (מנוע OCR/הבנת מסמכים, מקומי מול שירות ענן חיצוני, רמת דיוק נדרשת) טרם הוכרעה ברמת הארכיטקטורה — אין במסמך זה החלטה בעניין, במכוון, כדי לא להמציא ארכיטקטורה שלא אושרה. יש לקבוע זאת כהחלטת ארכיטקטורה נפרדת (ADR) לפני תחילת פיתוח מודול הקבלה.</w:t>
       </w:r>
     </w:p>
     <w:p>

</xml_diff>